<commit_message>
Etapa 3 Reporte terminado
</commit_message>
<xml_diff>
--- a/docs/quarto/reporte.docx
+++ b/docs/quarto/reporte.docx
@@ -2312,7 +2312,7 @@
     </w:p>
     <w:bookmarkEnd w:id="42"/>
     <w:bookmarkEnd w:id="43"/>
-    <w:bookmarkStart w:id="58" w:name="X6bd5c9f33f565ecf3d24105a9ce2931dc63db1b"/>
+    <w:bookmarkStart w:id="60" w:name="X6bd5c9f33f565ecf3d24105a9ce2931dc63db1b"/>
     <w:p>
       <w:pPr>
         <w:pStyle w:val="Heading1"/>
@@ -2343,7 +2343,7 @@
         <w:pStyle w:val="BodyText"/>
       </w:pPr>
       <w:r>
-        <w:t xml:space="preserve">El análisis se centrará en dos zonas meteorológicas, la primera zona meteorológica siendo</w:t>
+        <w:t xml:space="preserve">El análisis se centrará en los años 2024 y 2025, con el objetivo de evitar el sesgo debido a las consecuencias de la pandemia del COVID-19, de dos zonas meteorológicas, la primera zona meteorológica siendo</w:t>
       </w:r>
       <w:r>
         <w:t xml:space="preserve"> </w:t>
@@ -2361,15 +2361,15 @@
         <w:t xml:space="preserve">“NTE - Norte”</w:t>
       </w:r>
       <w:r>
-        <w:t xml:space="preserve">, la cual está ubicada en el municipio de Escobedo. Se seleccionaron estas dos zonas meteorológicas con el propósito de llevar a cabo el análisis en dos zonas con concentraciones poblacionales distintas. Por un lado, el centro del municipio de Monterrey es una zona con una concentración poblacional alta comparada con las zonas a su alrededor, especialmente el municipio de Escobedo, mientras que, por otro lado, el municipio de Escobedo es una zona con una concentración poblacional baja, comparada con el centro del municipio de Monterrey. Cabe destacar que las zonas meteorológicas, en las cuales se centrará el análisis, han sido las mismas desde que se inició con este reto.</w:t>
-      </w:r>
-    </w:p>
-    <w:p>
-      <w:pPr>
-        <w:pStyle w:val="BodyText"/>
-      </w:pPr>
-      <w:r>
-        <w:t xml:space="preserve">El análisis se llevará a cabo mediante el uso de, en primer lugar, un modelo de regresión lineal multivariada, en donde se tienen múltiples variables dependientes o de respuesta y múltiples variables independientes o predictoras. Por un lado las variables dependientes son las siguientes: material particulado menor a 10 micrómetros (PM10), material particulado menor a 2.5 micrómetros (PM2.5), ozono (O3), dióxido de azufre (SO2), dióxido de nitrógeno (NO2), monóxido de carbono (CO), monóxido de nitrógeno (NO), la suma de NO + NO2 (NOX). Por otro lado, las variables independientes son las siguientes: fecha y hora, temperatura (TOUT), humedad relativa (RH), radiación solar (SR), precipitación (RAINF), presión atmosférica (PRS), velocidad del viento (WSR), dirección del viento (WDR). Ya habiendo llevado a cabo el modelo de regresión lineal, como primer acercamiento, se llevará a cabo, en segundo lugar, el método</w:t>
+        <w:t xml:space="preserve">, la cual está ubicada en el municipio de Escobedo. Se seleccionaron estas dos zonas meteorológicas con el propósito de llevar a cabo el análisis en dos zonas con concentraciones poblacionales distintas. Por un lado, el centro del municipio de Monterrey es una zona con una concentración poblacional alta comparada con las zonas a su alrededor, especialmente el municipio de Escobedo, mientras que, por otro lado, el municipio de Escobedo es una zona con una concentración poblacional baja, comparada con el centro del municipio de Monterrey. Cabe destacar que los años y las zonas meteorológicas, en las cuales se centrará el análisis, han sido las mismas desde que se inició con este reto.</w:t>
+      </w:r>
+    </w:p>
+    <w:p>
+      <w:pPr>
+        <w:pStyle w:val="BodyText"/>
+      </w:pPr>
+      <w:r>
+        <w:t xml:space="preserve">El análisis se llevará a cabo, para cada zona meteorológica, mediante el uso de, en primer lugar, un modelo de regresión lineal multivariada, en donde se tienen múltiples variables dependientes o de respuesta y múltiples variables independientes o predictoras. Por un lado las variables dependientes son las siguientes: material particulado menor a 10 micrómetros (PM10), material particulado menor a 2.5 micrómetros (PM2.5), ozono (O3), dióxido de azufre (SO2), dióxido de nitrógeno (NO2), monóxido de carbono (CO), monóxido de nitrógeno (NO), la suma de NO + NO2 (NOX). Por otro lado, las variables independientes son las siguientes: fecha y hora, temperatura (TOUT), humedad relativa (RH), radiación solar (SR), precipitación (RAINF), presión atmosférica (PRS), velocidad del viento (WSR), dirección del viento (WDR). Ya habiendo llevado a cabo el modelo de regresión lineal, como primer acercamiento, se llevará a cabo, en segundo lugar, el método</w:t>
       </w:r>
       <w:r>
         <w:t xml:space="preserve"> </w:t>
@@ -2668,6 +2668,412 @@
         </w:rPr>
         <w:t xml:space="preserve">F-statistic:  2695 on 8 and 13119 DF,  p-value: &lt; 2.2e-16</w:t>
       </w:r>
+    </w:p>
+    <w:p>
+      <w:pPr>
+        <w:pStyle w:val="FirstParagraph"/>
+      </w:pPr>
+      <w:r>
+        <w:t xml:space="preserve">El modelo resultó de la siguiente manera:</w:t>
+      </w:r>
+    </w:p>
+    <w:p>
+      <w:pPr>
+        <w:pStyle w:val="BodyText"/>
+      </w:pPr>
+      <m:oMathPara>
+        <m:oMathParaPr>
+          <m:jc m:val="center"/>
+        </m:oMathParaPr>
+        <m:oMath>
+          <m:r>
+            <m:t>O</m:t>
+          </m:r>
+          <m:r>
+            <m:t>3</m:t>
+          </m:r>
+          <m:r>
+            <m:rPr>
+              <m:sty m:val="p"/>
+            </m:rPr>
+            <m:t>=</m:t>
+          </m:r>
+          <m:d>
+            <m:dPr>
+              <m:begChr m:val="("/>
+              <m:endChr m:val=")"/>
+              <m:sepChr m:val=""/>
+              <m:grow/>
+            </m:dPr>
+            <m:e>
+              <m:r>
+                <m:rPr>
+                  <m:sty m:val="p"/>
+                </m:rPr>
+                <m:t>−</m:t>
+              </m:r>
+              <m:r>
+                <m:t>1.148</m:t>
+              </m:r>
+              <m:r>
+                <m:t>e</m:t>
+              </m:r>
+              <m:r>
+                <m:rPr>
+                  <m:sty m:val="p"/>
+                </m:rPr>
+                <m:t>−</m:t>
+              </m:r>
+              <m:r>
+                <m:t>07</m:t>
+              </m:r>
+            </m:e>
+          </m:d>
+          <m:r>
+            <m:t>F</m:t>
+          </m:r>
+          <m:r>
+            <m:t>E</m:t>
+          </m:r>
+          <m:r>
+            <m:t>C</m:t>
+          </m:r>
+          <m:r>
+            <m:t>H</m:t>
+          </m:r>
+          <m:r>
+            <m:t>A</m:t>
+          </m:r>
+          <m:r>
+            <m:rPr>
+              <m:sty m:val="p"/>
+            </m:rPr>
+            <m:t>+</m:t>
+          </m:r>
+          <m:d>
+            <m:dPr>
+              <m:begChr m:val="("/>
+              <m:endChr m:val=")"/>
+              <m:sepChr m:val=""/>
+              <m:grow/>
+            </m:dPr>
+            <m:e>
+              <m:r>
+                <m:rPr>
+                  <m:sty m:val="p"/>
+                </m:rPr>
+                <m:t>−</m:t>
+              </m:r>
+              <m:r>
+                <m:t>7.600</m:t>
+              </m:r>
+              <m:r>
+                <m:t>e</m:t>
+              </m:r>
+              <m:r>
+                <m:rPr>
+                  <m:sty m:val="p"/>
+                </m:rPr>
+                <m:t>−</m:t>
+              </m:r>
+              <m:r>
+                <m:t>02</m:t>
+              </m:r>
+            </m:e>
+          </m:d>
+          <m:r>
+            <m:t>P</m:t>
+          </m:r>
+          <m:r>
+            <m:t>R</m:t>
+          </m:r>
+          <m:r>
+            <m:t>S</m:t>
+          </m:r>
+          <m:r>
+            <m:rPr>
+              <m:sty m:val="p"/>
+            </m:rPr>
+            <m:t>+</m:t>
+          </m:r>
+          <m:d>
+            <m:dPr>
+              <m:begChr m:val="("/>
+              <m:endChr m:val=")"/>
+              <m:sepChr m:val=""/>
+              <m:grow/>
+            </m:dPr>
+            <m:e>
+              <m:r>
+                <m:rPr>
+                  <m:sty m:val="p"/>
+                </m:rPr>
+                <m:t>−</m:t>
+              </m:r>
+              <m:r>
+                <m:t>7.810</m:t>
+              </m:r>
+              <m:r>
+                <m:t>e</m:t>
+              </m:r>
+              <m:r>
+                <m:rPr>
+                  <m:sty m:val="p"/>
+                </m:rPr>
+                <m:t>−</m:t>
+              </m:r>
+              <m:r>
+                <m:t>01</m:t>
+              </m:r>
+            </m:e>
+          </m:d>
+          <m:r>
+            <m:t>R</m:t>
+          </m:r>
+          <m:r>
+            <m:t>A</m:t>
+          </m:r>
+          <m:r>
+            <m:t>I</m:t>
+          </m:r>
+          <m:r>
+            <m:t>N</m:t>
+          </m:r>
+          <m:r>
+            <m:t>F</m:t>
+          </m:r>
+          <m:r>
+            <m:rPr>
+              <m:sty m:val="p"/>
+            </m:rPr>
+            <m:t>+</m:t>
+          </m:r>
+          <m:d>
+            <m:dPr>
+              <m:begChr m:val="("/>
+              <m:endChr m:val=")"/>
+              <m:sepChr m:val=""/>
+              <m:grow/>
+            </m:dPr>
+            <m:e>
+              <m:r>
+                <m:rPr>
+                  <m:sty m:val="p"/>
+                </m:rPr>
+                <m:t>−</m:t>
+              </m:r>
+              <m:r>
+                <m:t>4.060</m:t>
+              </m:r>
+              <m:r>
+                <m:t>e</m:t>
+              </m:r>
+              <m:r>
+                <m:rPr>
+                  <m:sty m:val="p"/>
+                </m:rPr>
+                <m:t>−</m:t>
+              </m:r>
+              <m:r>
+                <m:t>01</m:t>
+              </m:r>
+            </m:e>
+          </m:d>
+          <m:r>
+            <m:t>R</m:t>
+          </m:r>
+          <m:r>
+            <m:t>H</m:t>
+          </m:r>
+          <m:r>
+            <m:rPr>
+              <m:sty m:val="p"/>
+            </m:rPr>
+            <m:t>+</m:t>
+          </m:r>
+          <m:d>
+            <m:dPr>
+              <m:begChr m:val="("/>
+              <m:endChr m:val=")"/>
+              <m:sepChr m:val=""/>
+              <m:grow/>
+            </m:dPr>
+            <m:e>
+              <m:r>
+                <m:t>1.989</m:t>
+              </m:r>
+              <m:r>
+                <m:t>e</m:t>
+              </m:r>
+              <m:r>
+                <m:rPr>
+                  <m:sty m:val="p"/>
+                </m:rPr>
+                <m:t>+</m:t>
+              </m:r>
+              <m:r>
+                <m:t>01</m:t>
+              </m:r>
+            </m:e>
+          </m:d>
+          <m:r>
+            <m:t>S</m:t>
+          </m:r>
+          <m:r>
+            <m:t>R</m:t>
+          </m:r>
+          <m:r>
+            <m:rPr>
+              <m:sty m:val="p"/>
+            </m:rPr>
+            <m:t>+</m:t>
+          </m:r>
+          <m:d>
+            <m:dPr>
+              <m:begChr m:val="("/>
+              <m:endChr m:val=")"/>
+              <m:sepChr m:val=""/>
+              <m:grow/>
+            </m:dPr>
+            <m:e>
+              <m:r>
+                <m:t>4.533</m:t>
+              </m:r>
+              <m:r>
+                <m:t>e</m:t>
+              </m:r>
+              <m:r>
+                <m:rPr>
+                  <m:sty m:val="p"/>
+                </m:rPr>
+                <m:t>−</m:t>
+              </m:r>
+              <m:r>
+                <m:t>01</m:t>
+              </m:r>
+            </m:e>
+          </m:d>
+          <m:r>
+            <m:t>T</m:t>
+          </m:r>
+          <m:r>
+            <m:t>O</m:t>
+          </m:r>
+          <m:r>
+            <m:t>U</m:t>
+          </m:r>
+          <m:r>
+            <m:t>T</m:t>
+          </m:r>
+          <m:r>
+            <m:rPr>
+              <m:sty m:val="p"/>
+            </m:rPr>
+            <m:t>+</m:t>
+          </m:r>
+          <m:d>
+            <m:dPr>
+              <m:begChr m:val="("/>
+              <m:endChr m:val=")"/>
+              <m:sepChr m:val=""/>
+              <m:grow/>
+            </m:dPr>
+            <m:e>
+              <m:r>
+                <m:t>1.178</m:t>
+              </m:r>
+              <m:r>
+                <m:t>e</m:t>
+              </m:r>
+              <m:r>
+                <m:rPr>
+                  <m:sty m:val="p"/>
+                </m:rPr>
+                <m:t>+</m:t>
+              </m:r>
+              <m:r>
+                <m:t>00</m:t>
+              </m:r>
+            </m:e>
+          </m:d>
+          <m:r>
+            <m:t>W</m:t>
+          </m:r>
+          <m:r>
+            <m:t>S</m:t>
+          </m:r>
+          <m:r>
+            <m:t>R</m:t>
+          </m:r>
+          <m:r>
+            <m:rPr>
+              <m:sty m:val="p"/>
+            </m:rPr>
+            <m:t>+</m:t>
+          </m:r>
+          <m:d>
+            <m:dPr>
+              <m:begChr m:val="("/>
+              <m:endChr m:val=")"/>
+              <m:sepChr m:val=""/>
+              <m:grow/>
+            </m:dPr>
+            <m:e>
+              <m:r>
+                <m:rPr>
+                  <m:sty m:val="p"/>
+                </m:rPr>
+                <m:t>−</m:t>
+              </m:r>
+              <m:r>
+                <m:t>1.962</m:t>
+              </m:r>
+              <m:r>
+                <m:t>e</m:t>
+              </m:r>
+              <m:r>
+                <m:rPr>
+                  <m:sty m:val="p"/>
+                </m:rPr>
+                <m:t>−</m:t>
+              </m:r>
+              <m:r>
+                <m:t>02</m:t>
+              </m:r>
+            </m:e>
+          </m:d>
+          <m:r>
+            <m:t>W</m:t>
+          </m:r>
+          <m:r>
+            <m:t>D</m:t>
+          </m:r>
+          <m:r>
+            <m:t>R</m:t>
+          </m:r>
+          <m:r>
+            <m:rPr>
+              <m:sty m:val="p"/>
+            </m:rPr>
+            <m:t>+</m:t>
+          </m:r>
+          <m:r>
+            <m:t>2.846</m:t>
+          </m:r>
+          <m:r>
+            <m:t>e</m:t>
+          </m:r>
+          <m:r>
+            <m:rPr>
+              <m:sty m:val="p"/>
+            </m:rPr>
+            <m:t>+</m:t>
+          </m:r>
+          <m:r>
+            <m:t>02</m:t>
+          </m:r>
+        </m:oMath>
+      </m:oMathPara>
     </w:p>
     <w:p>
       <w:pPr>
@@ -2719,60 +3125,7 @@
     </w:p>
     <w:p>
       <w:pPr>
-        <w:pStyle w:val="SourceCode"/>
-      </w:pPr>
-      <w:r>
-        <w:rPr>
-          <w:rStyle w:val="FunctionTok"/>
-        </w:rPr>
-        <w:t xml:space="preserve">plot</w:t>
-      </w:r>
-      <w:r>
-        <w:rPr>
-          <w:rStyle w:val="NormalTok"/>
-        </w:rPr>
-        <w:t xml:space="preserve">(model_ce_o3,</w:t>
-      </w:r>
-      <w:r>
-        <w:rPr>
-          <w:rStyle w:val="AttributeTok"/>
-        </w:rPr>
-        <w:t xml:space="preserve">which=</w:t>
-      </w:r>
-      <w:r>
-        <w:rPr>
-          <w:rStyle w:val="DecValTok"/>
-        </w:rPr>
-        <w:t xml:space="preserve">1</w:t>
-      </w:r>
-      <w:r>
-        <w:rPr>
-          <w:rStyle w:val="NormalTok"/>
-        </w:rPr>
-        <w:t xml:space="preserve">,</w:t>
-      </w:r>
-      <w:r>
-        <w:rPr>
-          <w:rStyle w:val="AttributeTok"/>
-        </w:rPr>
-        <w:t xml:space="preserve">lwd=</w:t>
-      </w:r>
-      <w:r>
-        <w:rPr>
-          <w:rStyle w:val="DecValTok"/>
-        </w:rPr>
-        <w:t xml:space="preserve">3</w:t>
-      </w:r>
-      <w:r>
-        <w:rPr>
-          <w:rStyle w:val="NormalTok"/>
-        </w:rPr>
-        <w:t xml:space="preserve">)</w:t>
-      </w:r>
-    </w:p>
-    <w:p>
-      <w:pPr>
-        <w:pStyle w:val="FirstParagraph"/>
+        <w:pStyle w:val="BodyText"/>
       </w:pPr>
       <w:r>
         <w:drawing>
@@ -2835,60 +3188,7 @@
     </w:p>
     <w:p>
       <w:pPr>
-        <w:pStyle w:val="SourceCode"/>
-      </w:pPr>
-      <w:r>
-        <w:rPr>
-          <w:rStyle w:val="FunctionTok"/>
-        </w:rPr>
-        <w:t xml:space="preserve">plot</w:t>
-      </w:r>
-      <w:r>
-        <w:rPr>
-          <w:rStyle w:val="NormalTok"/>
-        </w:rPr>
-        <w:t xml:space="preserve">(model_ce_o3,</w:t>
-      </w:r>
-      <w:r>
-        <w:rPr>
-          <w:rStyle w:val="AttributeTok"/>
-        </w:rPr>
-        <w:t xml:space="preserve">which=</w:t>
-      </w:r>
-      <w:r>
-        <w:rPr>
-          <w:rStyle w:val="DecValTok"/>
-        </w:rPr>
-        <w:t xml:space="preserve">2</w:t>
-      </w:r>
-      <w:r>
-        <w:rPr>
-          <w:rStyle w:val="NormalTok"/>
-        </w:rPr>
-        <w:t xml:space="preserve">,</w:t>
-      </w:r>
-      <w:r>
-        <w:rPr>
-          <w:rStyle w:val="AttributeTok"/>
-        </w:rPr>
-        <w:t xml:space="preserve">lwd=</w:t>
-      </w:r>
-      <w:r>
-        <w:rPr>
-          <w:rStyle w:val="DecValTok"/>
-        </w:rPr>
-        <w:t xml:space="preserve">3</w:t>
-      </w:r>
-      <w:r>
-        <w:rPr>
-          <w:rStyle w:val="NormalTok"/>
-        </w:rPr>
-        <w:t xml:space="preserve">)</w:t>
-      </w:r>
-    </w:p>
-    <w:p>
-      <w:pPr>
-        <w:pStyle w:val="FirstParagraph"/>
+        <w:pStyle w:val="BodyText"/>
       </w:pPr>
       <w:r>
         <w:drawing>
@@ -2951,60 +3251,7 @@
     </w:p>
     <w:p>
       <w:pPr>
-        <w:pStyle w:val="SourceCode"/>
-      </w:pPr>
-      <w:r>
-        <w:rPr>
-          <w:rStyle w:val="FunctionTok"/>
-        </w:rPr>
-        <w:t xml:space="preserve">plot</w:t>
-      </w:r>
-      <w:r>
-        <w:rPr>
-          <w:rStyle w:val="NormalTok"/>
-        </w:rPr>
-        <w:t xml:space="preserve">(model_ce_o3,</w:t>
-      </w:r>
-      <w:r>
-        <w:rPr>
-          <w:rStyle w:val="AttributeTok"/>
-        </w:rPr>
-        <w:t xml:space="preserve">which=</w:t>
-      </w:r>
-      <w:r>
-        <w:rPr>
-          <w:rStyle w:val="DecValTok"/>
-        </w:rPr>
-        <w:t xml:space="preserve">3</w:t>
-      </w:r>
-      <w:r>
-        <w:rPr>
-          <w:rStyle w:val="NormalTok"/>
-        </w:rPr>
-        <w:t xml:space="preserve">,</w:t>
-      </w:r>
-      <w:r>
-        <w:rPr>
-          <w:rStyle w:val="AttributeTok"/>
-        </w:rPr>
-        <w:t xml:space="preserve">lwd=</w:t>
-      </w:r>
-      <w:r>
-        <w:rPr>
-          <w:rStyle w:val="DecValTok"/>
-        </w:rPr>
-        <w:t xml:space="preserve">3</w:t>
-      </w:r>
-      <w:r>
-        <w:rPr>
-          <w:rStyle w:val="NormalTok"/>
-        </w:rPr>
-        <w:t xml:space="preserve">)</w:t>
-      </w:r>
-    </w:p>
-    <w:p>
-      <w:pPr>
-        <w:pStyle w:val="FirstParagraph"/>
+        <w:pStyle w:val="BodyText"/>
       </w:pPr>
       <w:r>
         <w:drawing>
@@ -3071,208 +3318,9 @@
       </w:pPr>
       <w:r>
         <w:rPr>
-          <w:rStyle w:val="FunctionTok"/>
-        </w:rPr>
-        <w:t xml:space="preserve">library</w:t>
-      </w:r>
-      <w:r>
-        <w:rPr>
-          <w:rStyle w:val="NormalTok"/>
-        </w:rPr>
-        <w:t xml:space="preserve">(corrplot)</w:t>
-      </w:r>
-    </w:p>
-    <w:p>
-      <w:pPr>
-        <w:pStyle w:val="SourceCode"/>
-      </w:pPr>
-      <w:r>
-        <w:rPr>
-          <w:rStyle w:val="VerbatimChar"/>
-        </w:rPr>
-        <w:t xml:space="preserve">corrplot 0.95 loaded</w:t>
-      </w:r>
-    </w:p>
-    <w:p>
-      <w:pPr>
-        <w:pStyle w:val="SourceCode"/>
-      </w:pPr>
-      <w:r>
-        <w:rPr>
-          <w:rStyle w:val="FunctionTok"/>
-        </w:rPr>
-        <w:t xml:space="preserve">corrplot</w:t>
-      </w:r>
-      <w:r>
-        <w:rPr>
-          <w:rStyle w:val="NormalTok"/>
-        </w:rPr>
-        <w:t xml:space="preserve">(</w:t>
-      </w:r>
-      <w:r>
-        <w:rPr>
-          <w:rStyle w:val="FunctionTok"/>
-        </w:rPr>
-        <w:t xml:space="preserve">cor</w:t>
-      </w:r>
-      <w:r>
-        <w:rPr>
-          <w:rStyle w:val="NormalTok"/>
-        </w:rPr>
-        <w:t xml:space="preserve">(df_centro[, </w:t>
-      </w:r>
-      <w:r>
-        <w:rPr>
-          <w:rStyle w:val="FunctionTok"/>
-        </w:rPr>
-        <w:t xml:space="preserve">c</w:t>
-      </w:r>
-      <w:r>
-        <w:rPr>
-          <w:rStyle w:val="NormalTok"/>
-        </w:rPr>
-        <w:t xml:space="preserve">(</w:t>
-      </w:r>
-      <w:r>
-        <w:rPr>
-          <w:rStyle w:val="DecValTok"/>
-        </w:rPr>
-        <w:t xml:space="preserve">2</w:t>
-      </w:r>
-      <w:r>
-        <w:rPr>
-          <w:rStyle w:val="NormalTok"/>
-        </w:rPr>
-        <w:t xml:space="preserve">, </w:t>
-      </w:r>
-      <w:r>
-        <w:rPr>
-          <w:rStyle w:val="DecValTok"/>
-        </w:rPr>
-        <w:t xml:space="preserve">10</w:t>
-      </w:r>
-      <w:r>
-        <w:rPr>
-          <w:rStyle w:val="SpecialCharTok"/>
-        </w:rPr>
-        <w:t xml:space="preserve">:</w:t>
-      </w:r>
-      <w:r>
-        <w:rPr>
-          <w:rStyle w:val="DecValTok"/>
-        </w:rPr>
-        <w:t xml:space="preserve">12</w:t>
-      </w:r>
-      <w:r>
-        <w:rPr>
-          <w:rStyle w:val="NormalTok"/>
-        </w:rPr>
-        <w:t xml:space="preserve"> , </w:t>
-      </w:r>
-      <w:r>
-        <w:rPr>
-          <w:rStyle w:val="DecValTok"/>
-        </w:rPr>
-        <w:t xml:space="preserve">14</w:t>
-      </w:r>
-      <w:r>
-        <w:rPr>
-          <w:rStyle w:val="SpecialCharTok"/>
-        </w:rPr>
-        <w:t xml:space="preserve">:</w:t>
-      </w:r>
-      <w:r>
-        <w:rPr>
-          <w:rStyle w:val="DecValTok"/>
-        </w:rPr>
-        <w:t xml:space="preserve">17</w:t>
-      </w:r>
-      <w:r>
-        <w:rPr>
-          <w:rStyle w:val="NormalTok"/>
-        </w:rPr>
-        <w:t xml:space="preserve">)]),</w:t>
-      </w:r>
-      <w:r>
-        <w:br/>
-      </w:r>
-      <w:r>
-        <w:rPr>
-          <w:rStyle w:val="NormalTok"/>
-        </w:rPr>
-        <w:t xml:space="preserve">         </w:t>
-      </w:r>
-      <w:r>
-        <w:rPr>
-          <w:rStyle w:val="AttributeTok"/>
-        </w:rPr>
-        <w:t xml:space="preserve">method =</w:t>
-      </w:r>
-      <w:r>
-        <w:rPr>
-          <w:rStyle w:val="NormalTok"/>
-        </w:rPr>
-        <w:t xml:space="preserve"> </w:t>
-      </w:r>
-      <w:r>
-        <w:rPr>
-          <w:rStyle w:val="StringTok"/>
-        </w:rPr>
-        <w:t xml:space="preserve">"color"</w:t>
-      </w:r>
-      <w:r>
-        <w:rPr>
-          <w:rStyle w:val="NormalTok"/>
-        </w:rPr>
-        <w:t xml:space="preserve">, </w:t>
-      </w:r>
-      <w:r>
-        <w:rPr>
-          <w:rStyle w:val="AttributeTok"/>
-        </w:rPr>
-        <w:t xml:space="preserve">type =</w:t>
-      </w:r>
-      <w:r>
-        <w:rPr>
-          <w:rStyle w:val="NormalTok"/>
-        </w:rPr>
-        <w:t xml:space="preserve"> </w:t>
-      </w:r>
-      <w:r>
-        <w:rPr>
-          <w:rStyle w:val="StringTok"/>
-        </w:rPr>
-        <w:t xml:space="preserve">"upper"</w:t>
-      </w:r>
-      <w:r>
-        <w:rPr>
-          <w:rStyle w:val="NormalTok"/>
-        </w:rPr>
-        <w:t xml:space="preserve">, </w:t>
-      </w:r>
-      <w:r>
-        <w:rPr>
-          <w:rStyle w:val="AttributeTok"/>
-        </w:rPr>
-        <w:t xml:space="preserve">tl.cex =</w:t>
-      </w:r>
-      <w:r>
-        <w:rPr>
-          <w:rStyle w:val="NormalTok"/>
-        </w:rPr>
-        <w:t xml:space="preserve"> </w:t>
-      </w:r>
-      <w:r>
-        <w:rPr>
-          <w:rStyle w:val="FloatTok"/>
-        </w:rPr>
-        <w:t xml:space="preserve">0.8</w:t>
-      </w:r>
-      <w:r>
-        <w:rPr>
-          <w:rStyle w:val="NormalTok"/>
-        </w:rPr>
-        <w:t xml:space="preserve">)</w:t>
+          <w:rStyle w:val="VerbatimChar"/>
+        </w:rPr>
+        <w:t xml:space="preserve">Cargando paquete requerido: ggplot2</w:t>
       </w:r>
     </w:p>
     <w:p>
@@ -3331,12 +3379,164 @@
       </w:r>
     </w:p>
     <w:bookmarkEnd w:id="56"/>
-    <w:bookmarkStart w:id="57" w:name="fuentes-bibliográficas-y-de-datos"/>
+    <w:bookmarkStart w:id="57" w:name="ii.-conclusión"/>
     <w:p>
       <w:pPr>
         <w:pStyle w:val="Heading3"/>
       </w:pPr>
       <w:r>
+        <w:t xml:space="preserve">II. Conclusión</w:t>
+      </w:r>
+    </w:p>
+    <w:p>
+      <w:pPr>
+        <w:pStyle w:val="FirstParagraph"/>
+      </w:pPr>
+      <w:r>
+        <w:t xml:space="preserve">Resumen de lo que hemos logrado hasta ahora:</w:t>
+      </w:r>
+    </w:p>
+    <w:p>
+      <w:pPr>
+        <w:pStyle w:val="BodyText"/>
+      </w:pPr>
+      <w:r>
+        <w:t xml:space="preserve">Aprovechando que estamos a una semana de concluir con este reto, es buen momento de reflexionar sobre lo que hemos logrado hasta ahora y las cosas que siguen por delante. Regresemos por un momento a la limpieza de las bases de datos, primer paso de esta situación problema y la clave de realizar un buen análisis de datos. Nos dimos cuenta que las bases tenían los nombres de las columnas diferentes, y no solo eso, sino que también había tipos de datos inconsistentes entre los diferentes años utilizados, cosa que también tuvimos que corregir. Afortunadamente, entre estas y muchas otras, pudimos sobreponer cada una de las dificultades que se nos presentaron a la hora de realizar la limpieza de datos y terminar reduciendo de un total de cuatro data sets a solamente dos divididos por lugar y que incluyan ambos años que nos dieron, esto para poder realizar un análisis más sencillo, pero para este punto aún había bastantes datos faltantes, por lo que había que pasar a realizar una imputación.</w:t>
+      </w:r>
+    </w:p>
+    <w:p>
+      <w:pPr>
+        <w:pStyle w:val="BodyText"/>
+      </w:pPr>
+      <w:r>
+        <w:t xml:space="preserve">La imputación de datos fue relativamente sencilla, pues afortunadamente tras convertir nuestras bases de datos a objetos</w:t>
+      </w:r>
+      <w:r>
+        <w:t xml:space="preserve"> </w:t>
+      </w:r>
+      <w:r>
+        <w:t xml:space="preserve">“Time series”</w:t>
+      </w:r>
+      <w:r>
+        <w:t xml:space="preserve"> </w:t>
+      </w:r>
+      <w:r>
+        <w:t xml:space="preserve">pudimos aprovechar de los diferentes métodos de imputación que ya están establecidos, y probamos todos los que harían sentido, como interpolación sencilla, Last Observation Carried Forward, Next Observation Carried Backward, entre otros, y nos dimos cuenta que la imputación realmente solo ayudaba a completar los datos, pero no realizaba un cambio drástico en las tendencias de los datos, así que decidimos utilizar un modelo de imputación para realizar esto, siendo el modelo</w:t>
+      </w:r>
+      <w:r>
+        <w:t xml:space="preserve"> </w:t>
+      </w:r>
+      <w:r>
+        <w:t xml:space="preserve">“auto.arima”</w:t>
+      </w:r>
+      <w:r>
+        <w:t xml:space="preserve"> </w:t>
+      </w:r>
+      <w:r>
+        <w:t xml:space="preserve">de la función</w:t>
+      </w:r>
+      <w:r>
+        <w:t xml:space="preserve"> </w:t>
+      </w:r>
+      <w:r>
+        <w:t xml:space="preserve">“na_kalman”</w:t>
+      </w:r>
+      <w:r>
+        <w:t xml:space="preserve"> </w:t>
+      </w:r>
+      <w:r>
+        <w:t xml:space="preserve">de la librería</w:t>
+      </w:r>
+      <w:r>
+        <w:t xml:space="preserve"> </w:t>
+      </w:r>
+      <w:r>
+        <w:t xml:space="preserve">“imputeTS”</w:t>
+      </w:r>
+      <w:r>
+        <w:t xml:space="preserve">, ya que el objetivo principal del proyecto es predecir, y este modelo fue creado con este mismo propósito. El proceso tomó alrededor de unas 14 horas para correr, a diferencia de los otros métodos, que tomaban minutos en conjunto, y terminamos con datos relativamente bien imputados, para los cuales realizamos Q-Q plots y boxplots por variable para buscar normalidad y comenzar este análisis.</w:t>
+      </w:r>
+    </w:p>
+    <w:p>
+      <w:pPr>
+        <w:pStyle w:val="BodyText"/>
+      </w:pPr>
+      <w:r>
+        <w:t xml:space="preserve">Y para comenzar el análisis decidimos aplicar tres técnicas de regresión, una multivariada y dos de regresión múltiple por variable dependiente. El primero fue un método multivariado utilizando absolutamente todos los contaminantes como variables independientes y todos los factores meteorológicos como variables dependientes. El segundo fue realizado empleando la técnica de regresión</w:t>
+      </w:r>
+      <w:r>
+        <w:t xml:space="preserve"> </w:t>
+      </w:r>
+      <w:r>
+        <w:t xml:space="preserve">“forward selection”</w:t>
+      </w:r>
+      <w:r>
+        <w:t xml:space="preserve">, en el que el modelo empezaba vacío, y utilizando el valor de la métrica</w:t>
+      </w:r>
+      <w:r>
+        <w:t xml:space="preserve"> </w:t>
+      </w:r>
+      <w:r>
+        <w:t xml:space="preserve">“Akaike Information Criterion”</w:t>
+      </w:r>
+      <w:r>
+        <w:t xml:space="preserve"> </w:t>
+      </w:r>
+      <w:r>
+        <w:t xml:space="preserve">(AIC), automáticamente se decidía qué variables serían las más relevantes a utilizar para el modelo de regresión, así hasta que esta métrica de criterio no tuviera un cambio significativo. Finalmente el tercer modelo se realizó empleando la técnica de regresión</w:t>
+      </w:r>
+      <w:r>
+        <w:t xml:space="preserve"> </w:t>
+      </w:r>
+      <w:r>
+        <w:t xml:space="preserve">“backward elimination”</w:t>
+      </w:r>
+      <w:r>
+        <w:t xml:space="preserve">, en el que, similar al</w:t>
+      </w:r>
+      <w:r>
+        <w:t xml:space="preserve"> </w:t>
+      </w:r>
+      <w:r>
+        <w:t xml:space="preserve">“forward selection”</w:t>
+      </w:r>
+      <w:r>
+        <w:t xml:space="preserve">, se seleccionan variables pero en este caso, en vez de comenzar vacío, el modelo comienza con todas las variables y se van removiendo hasta quedar solamente con las que se consideren relevantes. Esto se realizó por zona, por lo que al final del análisis terminamos con un total de 34 modelos diferentes de los cuales hicimos gráficas para interpretar.</w:t>
+      </w:r>
+    </w:p>
+    <w:p>
+      <w:pPr>
+        <w:pStyle w:val="BodyText"/>
+      </w:pPr>
+      <w:r>
+        <w:t xml:space="preserve">Lo único que faltaría por hacer sería un análisis más exhaustivo de lo que ya tenemos para buscar más tendencias, encontrar relaciones no vistas anteriormente entre las variables que puedan ayudarnos a tener mejores interpretaciones, y de ser necesario, realizar algún análisis estadístico como el análisis de factores o por componentes principales, pero por lo que vemos del proyecto y nuestros objetivos, no parece ser necesario.</w:t>
+      </w:r>
+    </w:p>
+    <w:bookmarkEnd w:id="57"/>
+    <w:bookmarkStart w:id="58" w:name="X4d9dcbf9ac737aaf221fbc719a7aa59dc1d5877"/>
+    <w:p>
+      <w:pPr>
+        <w:pStyle w:val="Heading3"/>
+      </w:pPr>
+      <w:r>
+        <w:t xml:space="preserve">III. Inserta la liga que dé acceso al código de tu trabajo</w:t>
+      </w:r>
+    </w:p>
+    <w:p>
+      <w:pPr>
+        <w:pStyle w:val="FirstParagraph"/>
+      </w:pPr>
+      <w:r>
+        <w:t xml:space="preserve">https://github.com/CCCCC11111/MA2003B_E7/tree/trunk</w:t>
+      </w:r>
+    </w:p>
+    <w:bookmarkEnd w:id="58"/>
+    <w:bookmarkStart w:id="59" w:name="fuentes-bibliográficas-y-de-datos"/>
+    <w:p>
+      <w:pPr>
+        <w:pStyle w:val="Heading3"/>
+      </w:pPr>
+      <w:r>
         <w:t xml:space="preserve">Fuentes bibliográficas y de datos</w:t>
       </w:r>
     </w:p>
@@ -3420,8 +3620,8 @@
         <w:t xml:space="preserve">[10] Wu B., Zhao S., Liu Y., &amp; Zhang C. (2025). Do meteorological variables impact air quality differently across urbanization gradients? A case study of Kaohsiung, Taiwan, China. ScienceDirect. https://www.sciencedirect.com/science/article/pii/S240584402500074X</w:t>
       </w:r>
     </w:p>
-    <w:bookmarkEnd w:id="57"/>
-    <w:bookmarkEnd w:id="58"/>
+    <w:bookmarkEnd w:id="59"/>
+    <w:bookmarkEnd w:id="60"/>
     <w:sectPr/>
   </w:body>
 </w:document>

</xml_diff>